<commit_message>
FOMC: Formulierungen wie beabsichtigt, Notebook-Zip
</commit_message>
<xml_diff>
--- a/Dobrytsia-Yurii/fomc/FOMC_Tonindex_Dobrytsia_30518764.docx
+++ b/Dobrytsia-Yurii/fomc/FOMC_Tonindex_Dobrytsia_30518764.docx
@@ -1114,7 +1114,7 @@
         <w:rPr>
           <w:lang w:val="de-DE"/>
         </w:rPr>
-        <w:t>Nach jeder Sitzung veröffentlicht der Offenmarktausschuss der US-Notenbank (Federal Open Market Committee, FOMC) eine kurze Erklärung, das Statement. Darin steht die Zinsentscheidung, vor allem aber eine Einschätzung der Lage. An den Finanzmärkten wird jedes Wort gelesen, denn der Ton verrät, ob die Notenbank eher zu höheren Zinsen neigt oder zu niedrigeren. Im Fachjargon nennt man einen Ton, der auf höhere Zinsen hindeutet, „hawkish“</w:t>
+        <w:t>Nach jeder Sitzung veröffentlicht der Offenmarktausschuss der US-Notenbank (Federal Open Market Committee, FOMC) eine kurze Erklärung, das Statement. Darin steht die Zinsentscheidung, vor allem aber eine Einschätzung der Lage. An den Finanzmärkten wird jedes Wort gelesen, denn der Ton verrät, ob die Notenbank eher zu höheren Zinsen neigt oder zu niedrigeren. Im Fachjargon nennt man einen Ton, der auf höhere Zinsen hindeutet „hawkish“</w:t>
       </w:r>
       <w:r>
         <w:rPr>
@@ -1972,7 +1972,7 @@
           <w:sz w:val="20"/>
           <w:szCs w:val="20"/>
         </w:rPr>
-        <w:t>DATA = Path('data')  # Quelle: https://huggingface.co/datasets/gtfintechlab/fomc_communication</w:t>
+        <w:t>DATA = Path('data')</w:t>
       </w:r>
       <w:r>
         <w:rPr>
@@ -4298,7 +4298,7 @@
         <w:rPr>
           <w:lang w:val="de-DE"/>
         </w:rPr>
-        <w:t>Shah et al. (2023) machen daraus eine Aufgabe für das maschinelle Lernen</w:t>
+        <w:t>Shah et al. (2023) machen daraus eine Aufgabe für das Maschinelle Lernen</w:t>
       </w:r>
       <w:r>
         <w:rPr>
@@ -9645,7 +9645,7 @@
         <w:rPr>
           <w:lang w:val="de-DE"/>
         </w:rPr>
-        <w:t xml:space="preserve"> Trainingsverlust fiel über die 4 Epochen von 1,0136 auf 0,4213</w:t>
+        <w:t xml:space="preserve"> Trainingsverlust fiel über die 4 Epochen &gt; 1,0136 &gt; 0,4213</w:t>
       </w:r>
       <w:r>
         <w:rPr>
@@ -13144,7 +13144,7 @@
         <w:rPr>
           <w:lang w:val="de-DE"/>
         </w:rPr>
-        <w:t xml:space="preserve">RoBERTa hält 39,2 % der Statement-Sätze für expansiv, 28,2 % für restriktiv und 32,5 % für neutral, während im Trainingsdatensatz </w:t>
+        <w:t xml:space="preserve">RoBERTa hält 39,2% der Statement-Sätze für expansiv, 28,2% für restriktiv und 32,5% für neutral, während im Trainingsdatensatz </w:t>
       </w:r>
       <w:r>
         <w:rPr>
@@ -16573,7 +16573,7 @@
         <w:rPr>
           <w:lang w:val="de-DE"/>
         </w:rPr>
-        <w:t xml:space="preserve">Über 3 Monate liegt die Trefferquote des Index bei 0,771, die Regel ohne Anstieg aber bei 0,790 und die der Trendregel bei 0,841. Über 12 Monate liegt der Index mit 0,670 gleichauf mit der Regel ohne Anstieg, die Trendregel erreicht </w:t>
+        <w:t xml:space="preserve">Über 3 Monate liegt die Trefferquote des Index bei 0,771, die Regel ohne Anstieg aber in 0,790 und die Trendregel in 0,841. Über 12 Monate liegt der Index mit 0,670 gleichauf mit der Regel ohne Anstieg, die Trendregel erreicht </w:t>
       </w:r>
       <w:r>
         <w:rPr>

</xml_diff>